<commit_message>
Enhance dose analysis with per-sensor measurement uncertainty
- Introduced per-sensor measurement uncertainty (sigma_V) from lead-brick analysis, improving dose calculations.
- Implemented parsing of sigma_V values from analysis_report.txt, with a fallback to transcribed values.
- Updated dose analysis report to include measurement sigma_V and combined results from R1 and R2 trials.
- Revised methodology documentation to clarify the use of sigma_V in uncertainty quantification and significance testing.
- Adjusted output formats in dose_analysis_report.txt and dose_summary.csv to reflect new calculations and significance metrics.
</commit_message>
<xml_diff>
--- a/RADFET_ISS_Dose_Analysis_Methodology.docx
+++ b/RADFET_ISS_Dose_Analysis_Methodology.docx
@@ -1004,7 +1004,7 @@
         <w:pStyle w:val="ListNumber"/>
       </w:pPr>
       <w:r>
-        <w:t>For each (sensor_group, channel), average dVt over the valid readings to get the sensor's mean dVt, with its sample standard deviation and standard error of the mean (SEM = std / sqrt(n)).</w:t>
+        <w:t>For each (sensor_group, channel), average dVt over the valid readings to get the sensor's mean dVt. The measurement uncertainty on that mean is the characterized per-sensor sigma_V from the lead-brick run (Section 8), not an SEM re-estimated from flight data.</w:t>
       </w:r>
     </w:p>
     <w:p>
@@ -1012,7 +1012,7 @@
         <w:pStyle w:val="ListNumber"/>
       </w:pPr>
       <w:r>
-        <w:t>Convert the mean dVt to dose using the selected curve (Section 5).</w:t>
+        <w:t>Combine the R1 and R2 trials per channel by inverse-variance weighting in voltage space, giving a combined dVt and its combined sigma_V. (Half the spread between the two trial doses is also reported as a repeatability check.)</w:t>
       </w:r>
     </w:p>
     <w:p>
@@ -1020,7 +1020,7 @@
         <w:pStyle w:val="ListNumber"/>
       </w:pPr>
       <w:r>
-        <w:t>Combine the R1 and R2 dose estimates for each channel into a single per-configuration dose (their mean). Half the spread between the two trials is reported as a trial-to-trial uncertainty.</w:t>
+        <w:t>Convert the combined dVt to dose using the selected curve (Section 5), and attach the full propagated uncertainty (Section 8).</w:t>
       </w:r>
     </w:p>
     <w:p>
@@ -1033,7 +1033,12 @@
     </w:p>
     <w:p>
       <w:r>
-        <w:t>We propagate a 1-sigma dose uncertainty through the inversion Dose = (dVt/A)^(1/B), combining measurement noise on dVt with the calibration uncertainties sigma(A) and sigma(B):</w:t>
+        <w:t>Per-sensor measurement uncertainty (sigma_V). In the lead-brick run the dose is essentially fixed, so each sensor's voltage spread is its characterized measurement noise floor. We take the per-sensor 'std dev (sample)' values directly from sensor_analysis/analysis_report.txt (read at runtime, so they stay in sync if the lead-brick analysis is re-run). These are of order 0.004-0.006 V and differ slightly per sensor. A coverage factor (e.g. 2-sigma) can be applied centrally if a more conservative budget is wanted.</w:t>
+      </w:r>
+    </w:p>
+    <w:p>
+      <w:r>
+        <w:t>Absolute dose uncertainty. We propagate a 1-sigma dose uncertainty through the inversion Dose = (dVt/A)^(1/B), combining the measured sigma_V with the calibration uncertainties sigma(A) and sigma(B):</w:t>
       </w:r>
     </w:p>
     <w:p>
@@ -1044,16 +1049,16 @@
         </w:rPr>
         <w:t>(sigma_Dose / Dose)^2 =</w:t>
         <w:br/>
-        <w:t xml:space="preserve">      ( sigma_dVt / (B * dVt) )^2     # measurement (SEM on dVt)</w:t>
+        <w:t xml:space="preserve">      ( sigma_V    / (B * dVt) )^2    # measurement (lead-brick sigma_V)</w:t>
         <w:br/>
-        <w:t xml:space="preserve">    + ( sigma_A  / (B * A)   )^2     # calibration uncertainty in A</w:t>
+        <w:t xml:space="preserve">    + ( sigma_A   / (B * A)   )^2    # calibration uncertainty in A</w:t>
         <w:br/>
         <w:t xml:space="preserve">    + ( ln(Dose) * sigma_B / B )^2   # calibration uncertainty in B</w:t>
       </w:r>
     </w:p>
     <w:p>
       <w:r>
-        <w:t>The measurement term uses the SEM of the sensor's readings. We report both this propagated 1-sigma and the independent trial-to-trial spread (R1 vs R2); broad disagreement between the two is a flag for an unmodeled systematic.</w:t>
+        <w:t>This full sigma is the error bar on the ABSOLUTE dose of a single configuration. The two trials R1 and R2 are combined by inverse-variance weighting in voltage space; the spread between them is reported separately as a repeatability check.</w:t>
       </w:r>
     </w:p>
     <w:p>
@@ -1061,7 +1066,7 @@
         <w:pStyle w:val="Heading1"/>
       </w:pPr>
       <w:r>
-        <w:t>9. Shielding-effectiveness analysis</w:t>
+        <w:t>9. Shielding effectiveness and statistical significance</w:t>
       </w:r>
     </w:p>
     <w:p>
@@ -1087,7 +1092,26 @@
     </w:p>
     <w:p>
       <w:r>
-        <w:t>These are reported per configuration alongside the combined dose and its uncertainty.</w:t>
+        <w:t>Is the difference statistically significant? This is the key question and it has an important subtlety. The same calibration curve is applied to every sensor, so the calibration uncertainties sigma(A), sigma(B) are COMMON-MODE: they shift all configurations together and largely cancel in a DIFFERENCE between two configurations. Adding them into a significance test would make us under-confident. We therefore test significance in VOLTAGE space, using only the measured sigma_V:</w:t>
+      </w:r>
+    </w:p>
+    <w:p>
+      <w:r>
+        <w:rPr>
+          <w:rFonts w:ascii="Consolas" w:hAnsi="Consolas"/>
+          <w:sz w:val="20"/>
+        </w:rPr>
+        <w:t>z = ( dVt_bare - dVt_config ) / sqrt( sigma_V_bare^2 + sigma_V_config^2 )</w:t>
+      </w:r>
+    </w:p>
+    <w:p>
+      <w:r>
+        <w:t>Because dose is a monotonic function of dVt, a significant difference in dVt is a significant difference in dose, and this avoids entangling the (correlated) calibration error. The combined sigma_V per configuration comes from the inverse-variance combination of its R1 and R2 trials. We flag |z| &gt; 1.96 as significant at 95% (~2 sigma) and |z| &gt; 3 at ~99.7% (~3 sigma), and also report the two-sided p-value.</w:t>
+      </w:r>
+    </w:p>
+    <w:p>
+      <w:r>
+        <w:t>Outputs include each configuration tested against the bare sensor and a full pairwise |z| matrix across all five configurations, so neighbouring stacks (which may differ by little) can be compared directly. The absolute dose with its full uncertainty (Section 8) is reported alongside for magnitude.</w:t>
       </w:r>
     </w:p>
     <w:p>

</xml_diff>